<commit_message>
docs(gs): 제품설명서 동기화 — 제품 버전 v1.42.16 · 비전 도구 40종(PointCloud Line Fit)
사용자 매뉴얼 §13.4(VMS 1.42.16)와 버전을 맞추고, v1.42.7 에서 추가된 PointCloud Line Fit 을
팔레트 표 3D Measurement(4→5종)·도구 수(39→40, 세 곳)에 반영. 사용 라이브러리 버전은 csproj 와 일치 확인.

Co-Authored-By: Claude Opus 5.5 <noreply@anthropic.com>
</commit_message>
<xml_diff>
--- a/docs/gs/VMS_제품설명서_v1.0.docx
+++ b/docs/gs/VMS_제품설명서_v1.0.docx
@@ -143,9 +143,11 @@
       <w:pPr>
         <w:pStyle w:val="Heading1"/>
       </w:pPr>
+      <w:bookmarkStart w:name="_Toc1" w:id="1"/>
       <w:r>
         <w:t xml:space="preserve">문서 정보</w:t>
       </w:r>
+      <w:bookmarkEnd w:id="1"/>
     </w:p>
     <w:tbl>
       <w:tblPr>
@@ -288,7 +290,7 @@
                 <w:sz w:val="19"/>
                 <w:szCs w:val="19"/>
               </w:rPr>
-              <w:t xml:space="preserve">v1.42.0</w:t>
+              <w:t xml:space="preserve">v1.42.16</w:t>
             </w:r>
           </w:p>
         </w:tc>
@@ -705,11 +707,506 @@
       </w:sdtPr>
       <w:sdtContent>
         <w:p>
+          <w:pPr>
+            <w:pStyle w:val="TOC1"/>
+            <w:tabs>
+              <w:tab w:val="right" w:pos="9026" w:leader="dot"/>
+            </w:tabs>
+          </w:pPr>
           <w:r>
             <w:fldChar w:fldCharType="begin" w:dirty="true"/>
             <w:instrText xml:space="preserve">TOC \h \o "1-2"</w:instrText>
             <w:fldChar w:fldCharType="separate"/>
           </w:r>
+          <w:hyperlink w:history="1" w:anchor="_Toc1">
+            <w:r>
+              <w:t xml:space="preserve">문서 정보</w:t>
+            </w:r>
+            <w:r>
+              <w:tab/>
+            </w:r>
+            <w:r>
+              <w:fldChar w:fldCharType="begin" w:dirty="true"/>
+              <w:instrText xml:space="preserve">PAGEREF _Toc1 \h</w:instrText>
+              <w:fldChar w:fldCharType="separate"/>
+              <w:fldChar w:fldCharType="end"/>
+            </w:r>
+          </w:hyperlink>
+        </w:p>
+        <w:p>
+          <w:pPr>
+            <w:pStyle w:val="TOC1"/>
+            <w:tabs>
+              <w:tab w:val="right" w:pos="9026" w:leader="dot"/>
+            </w:tabs>
+          </w:pPr>
+          <w:hyperlink w:history="1" w:anchor="_Toc2">
+            <w:r>
+              <w:t xml:space="preserve">1. 제품 개요</w:t>
+            </w:r>
+            <w:r>
+              <w:tab/>
+            </w:r>
+            <w:r>
+              <w:fldChar w:fldCharType="begin" w:dirty="true"/>
+              <w:instrText xml:space="preserve">PAGEREF _Toc2 \h</w:instrText>
+              <w:fldChar w:fldCharType="separate"/>
+              <w:fldChar w:fldCharType="end"/>
+            </w:r>
+          </w:hyperlink>
+        </w:p>
+        <w:p>
+          <w:pPr>
+            <w:pStyle w:val="TOC2"/>
+            <w:tabs>
+              <w:tab w:val="right" w:pos="9026" w:leader="dot"/>
+            </w:tabs>
+            <w:ind w:left="220"/>
+          </w:pPr>
+          <w:hyperlink w:history="1" w:anchor="_Toc3">
+            <w:r>
+              <w:t xml:space="preserve">1.1 주요 특징</w:t>
+            </w:r>
+            <w:r>
+              <w:tab/>
+            </w:r>
+            <w:r>
+              <w:fldChar w:fldCharType="begin" w:dirty="true"/>
+              <w:instrText xml:space="preserve">PAGEREF _Toc3 \h</w:instrText>
+              <w:fldChar w:fldCharType="separate"/>
+              <w:fldChar w:fldCharType="end"/>
+            </w:r>
+          </w:hyperlink>
+        </w:p>
+        <w:p>
+          <w:pPr>
+            <w:pStyle w:val="TOC1"/>
+            <w:tabs>
+              <w:tab w:val="right" w:pos="9026" w:leader="dot"/>
+            </w:tabs>
+          </w:pPr>
+          <w:hyperlink w:history="1" w:anchor="_Toc4">
+            <w:r>
+              <w:t xml:space="preserve">2. 목적 및 적용 범위</w:t>
+            </w:r>
+            <w:r>
+              <w:tab/>
+            </w:r>
+            <w:r>
+              <w:fldChar w:fldCharType="begin" w:dirty="true"/>
+              <w:instrText xml:space="preserve">PAGEREF _Toc4 \h</w:instrText>
+              <w:fldChar w:fldCharType="separate"/>
+              <w:fldChar w:fldCharType="end"/>
+            </w:r>
+          </w:hyperlink>
+        </w:p>
+        <w:p>
+          <w:pPr>
+            <w:pStyle w:val="TOC2"/>
+            <w:tabs>
+              <w:tab w:val="right" w:pos="9026" w:leader="dot"/>
+            </w:tabs>
+            <w:ind w:left="220"/>
+          </w:pPr>
+          <w:hyperlink w:history="1" w:anchor="_Toc5">
+            <w:r>
+              <w:t xml:space="preserve">2.1 목적</w:t>
+            </w:r>
+            <w:r>
+              <w:tab/>
+            </w:r>
+            <w:r>
+              <w:fldChar w:fldCharType="begin" w:dirty="true"/>
+              <w:instrText xml:space="preserve">PAGEREF _Toc5 \h</w:instrText>
+              <w:fldChar w:fldCharType="separate"/>
+              <w:fldChar w:fldCharType="end"/>
+            </w:r>
+          </w:hyperlink>
+        </w:p>
+        <w:p>
+          <w:pPr>
+            <w:pStyle w:val="TOC2"/>
+            <w:tabs>
+              <w:tab w:val="right" w:pos="9026" w:leader="dot"/>
+            </w:tabs>
+            <w:ind w:left="220"/>
+          </w:pPr>
+          <w:hyperlink w:history="1" w:anchor="_Toc6">
+            <w:r>
+              <w:t xml:space="preserve">2.2 적용 범위</w:t>
+            </w:r>
+            <w:r>
+              <w:tab/>
+            </w:r>
+            <w:r>
+              <w:fldChar w:fldCharType="begin" w:dirty="true"/>
+              <w:instrText xml:space="preserve">PAGEREF _Toc6 \h</w:instrText>
+              <w:fldChar w:fldCharType="separate"/>
+              <w:fldChar w:fldCharType="end"/>
+            </w:r>
+          </w:hyperlink>
+        </w:p>
+        <w:p>
+          <w:pPr>
+            <w:pStyle w:val="TOC1"/>
+            <w:tabs>
+              <w:tab w:val="right" w:pos="9026" w:leader="dot"/>
+            </w:tabs>
+          </w:pPr>
+          <w:hyperlink w:history="1" w:anchor="_Toc7">
+            <w:r>
+              <w:t xml:space="preserve">3. 제품 구성</w:t>
+            </w:r>
+            <w:r>
+              <w:tab/>
+            </w:r>
+            <w:r>
+              <w:fldChar w:fldCharType="begin" w:dirty="true"/>
+              <w:instrText xml:space="preserve">PAGEREF _Toc7 \h</w:instrText>
+              <w:fldChar w:fldCharType="separate"/>
+              <w:fldChar w:fldCharType="end"/>
+            </w:r>
+          </w:hyperlink>
+        </w:p>
+        <w:p>
+          <w:pPr>
+            <w:pStyle w:val="TOC1"/>
+            <w:tabs>
+              <w:tab w:val="right" w:pos="9026" w:leader="dot"/>
+            </w:tabs>
+          </w:pPr>
+          <w:hyperlink w:history="1" w:anchor="_Toc8">
+            <w:r>
+              <w:t xml:space="preserve">4. 동작 환경 및 요구사항</w:t>
+            </w:r>
+            <w:r>
+              <w:tab/>
+            </w:r>
+            <w:r>
+              <w:fldChar w:fldCharType="begin" w:dirty="true"/>
+              <w:instrText xml:space="preserve">PAGEREF _Toc8 \h</w:instrText>
+              <w:fldChar w:fldCharType="separate"/>
+              <w:fldChar w:fldCharType="end"/>
+            </w:r>
+          </w:hyperlink>
+        </w:p>
+        <w:p>
+          <w:pPr>
+            <w:pStyle w:val="TOC2"/>
+            <w:tabs>
+              <w:tab w:val="right" w:pos="9026" w:leader="dot"/>
+            </w:tabs>
+            <w:ind w:left="220"/>
+          </w:pPr>
+          <w:hyperlink w:history="1" w:anchor="_Toc9">
+            <w:r>
+              <w:t xml:space="preserve">4.1 하드웨어 요구사항</w:t>
+            </w:r>
+            <w:r>
+              <w:tab/>
+            </w:r>
+            <w:r>
+              <w:fldChar w:fldCharType="begin" w:dirty="true"/>
+              <w:instrText xml:space="preserve">PAGEREF _Toc9 \h</w:instrText>
+              <w:fldChar w:fldCharType="separate"/>
+              <w:fldChar w:fldCharType="end"/>
+            </w:r>
+          </w:hyperlink>
+        </w:p>
+        <w:p>
+          <w:pPr>
+            <w:pStyle w:val="TOC2"/>
+            <w:tabs>
+              <w:tab w:val="right" w:pos="9026" w:leader="dot"/>
+            </w:tabs>
+            <w:ind w:left="220"/>
+          </w:pPr>
+          <w:hyperlink w:history="1" w:anchor="_Toc10">
+            <w:r>
+              <w:t xml:space="preserve">4.2 소프트웨어 요구사항</w:t>
+            </w:r>
+            <w:r>
+              <w:tab/>
+            </w:r>
+            <w:r>
+              <w:fldChar w:fldCharType="begin" w:dirty="true"/>
+              <w:instrText xml:space="preserve">PAGEREF _Toc10 \h</w:instrText>
+              <w:fldChar w:fldCharType="separate"/>
+              <w:fldChar w:fldCharType="end"/>
+            </w:r>
+          </w:hyperlink>
+        </w:p>
+        <w:p>
+          <w:pPr>
+            <w:pStyle w:val="TOC2"/>
+            <w:tabs>
+              <w:tab w:val="right" w:pos="9026" w:leader="dot"/>
+            </w:tabs>
+            <w:ind w:left="220"/>
+          </w:pPr>
+          <w:hyperlink w:history="1" w:anchor="_Toc11">
+            <w:r>
+              <w:t xml:space="preserve">4.3 주요 사용 라이브러리</w:t>
+            </w:r>
+            <w:r>
+              <w:tab/>
+            </w:r>
+            <w:r>
+              <w:fldChar w:fldCharType="begin" w:dirty="true"/>
+              <w:instrText xml:space="preserve">PAGEREF _Toc11 \h</w:instrText>
+              <w:fldChar w:fldCharType="separate"/>
+              <w:fldChar w:fldCharType="end"/>
+            </w:r>
+          </w:hyperlink>
+        </w:p>
+        <w:p>
+          <w:pPr>
+            <w:pStyle w:val="TOC1"/>
+            <w:tabs>
+              <w:tab w:val="right" w:pos="9026" w:leader="dot"/>
+            </w:tabs>
+          </w:pPr>
+          <w:hyperlink w:history="1" w:anchor="_Toc12">
+            <w:r>
+              <w:t xml:space="preserve">5. 설치 및 실행 개요</w:t>
+            </w:r>
+            <w:r>
+              <w:tab/>
+            </w:r>
+            <w:r>
+              <w:fldChar w:fldCharType="begin" w:dirty="true"/>
+              <w:instrText xml:space="preserve">PAGEREF _Toc12 \h</w:instrText>
+              <w:fldChar w:fldCharType="separate"/>
+              <w:fldChar w:fldCharType="end"/>
+            </w:r>
+          </w:hyperlink>
+        </w:p>
+        <w:p>
+          <w:pPr>
+            <w:pStyle w:val="TOC1"/>
+            <w:tabs>
+              <w:tab w:val="right" w:pos="9026" w:leader="dot"/>
+            </w:tabs>
+          </w:pPr>
+          <w:hyperlink w:history="1" w:anchor="_Toc13">
+            <w:r>
+              <w:t xml:space="preserve">6. 기능 명세 (Function List)</w:t>
+            </w:r>
+            <w:r>
+              <w:tab/>
+            </w:r>
+            <w:r>
+              <w:fldChar w:fldCharType="begin" w:dirty="true"/>
+              <w:instrText xml:space="preserve">PAGEREF _Toc13 \h</w:instrText>
+              <w:fldChar w:fldCharType="separate"/>
+              <w:fldChar w:fldCharType="end"/>
+            </w:r>
+          </w:hyperlink>
+        </w:p>
+        <w:p>
+          <w:pPr>
+            <w:pStyle w:val="TOC2"/>
+            <w:tabs>
+              <w:tab w:val="right" w:pos="9026" w:leader="dot"/>
+            </w:tabs>
+            <w:ind w:left="220"/>
+          </w:pPr>
+          <w:hyperlink w:history="1" w:anchor="_Toc14">
+            <w:r>
+              <w:t xml:space="preserve">6.1 시스템 설정 — VMS.AppSetup</w:t>
+            </w:r>
+            <w:r>
+              <w:tab/>
+            </w:r>
+            <w:r>
+              <w:fldChar w:fldCharType="begin" w:dirty="true"/>
+              <w:instrText xml:space="preserve">PAGEREF _Toc14 \h</w:instrText>
+              <w:fldChar w:fldCharType="separate"/>
+              <w:fldChar w:fldCharType="end"/>
+            </w:r>
+          </w:hyperlink>
+        </w:p>
+        <w:p>
+          <w:pPr>
+            <w:pStyle w:val="TOC2"/>
+            <w:tabs>
+              <w:tab w:val="right" w:pos="9026" w:leader="dot"/>
+            </w:tabs>
+            <w:ind w:left="220"/>
+          </w:pPr>
+          <w:hyperlink w:history="1" w:anchor="_Toc15">
+            <w:r>
+              <w:t xml:space="preserve">6.2 운영 클라이언트 — VMS (메인 화면)</w:t>
+            </w:r>
+            <w:r>
+              <w:tab/>
+            </w:r>
+            <w:r>
+              <w:fldChar w:fldCharType="begin" w:dirty="true"/>
+              <w:instrText xml:space="preserve">PAGEREF _Toc15 \h</w:instrText>
+              <w:fldChar w:fldCharType="separate"/>
+              <w:fldChar w:fldCharType="end"/>
+            </w:r>
+          </w:hyperlink>
+        </w:p>
+        <w:p>
+          <w:pPr>
+            <w:pStyle w:val="TOC2"/>
+            <w:tabs>
+              <w:tab w:val="right" w:pos="9026" w:leader="dot"/>
+            </w:tabs>
+            <w:ind w:left="220"/>
+          </w:pPr>
+          <w:hyperlink w:history="1" w:anchor="_Toc16">
+            <w:r>
+              <w:t xml:space="preserve">6.3 비전 설정 — VMS.VisionSetup</w:t>
+            </w:r>
+            <w:r>
+              <w:tab/>
+            </w:r>
+            <w:r>
+              <w:fldChar w:fldCharType="begin" w:dirty="true"/>
+              <w:instrText xml:space="preserve">PAGEREF _Toc16 \h</w:instrText>
+              <w:fldChar w:fldCharType="separate"/>
+              <w:fldChar w:fldCharType="end"/>
+            </w:r>
+          </w:hyperlink>
+        </w:p>
+        <w:p>
+          <w:pPr>
+            <w:pStyle w:val="TOC2"/>
+            <w:tabs>
+              <w:tab w:val="right" w:pos="9026" w:leader="dot"/>
+            </w:tabs>
+            <w:ind w:left="220"/>
+          </w:pPr>
+          <w:hyperlink w:history="1" w:anchor="_Toc17">
+            <w:r>
+              <w:t xml:space="preserve">6.4 관리/MES 웹 — BODA.VMS.Web (선택 연동)</w:t>
+            </w:r>
+            <w:r>
+              <w:tab/>
+            </w:r>
+            <w:r>
+              <w:fldChar w:fldCharType="begin" w:dirty="true"/>
+              <w:instrText xml:space="preserve">PAGEREF _Toc17 \h</w:instrText>
+              <w:fldChar w:fldCharType="separate"/>
+              <w:fldChar w:fldCharType="end"/>
+            </w:r>
+          </w:hyperlink>
+        </w:p>
+        <w:p>
+          <w:pPr>
+            <w:pStyle w:val="TOC1"/>
+            <w:tabs>
+              <w:tab w:val="right" w:pos="9026" w:leader="dot"/>
+            </w:tabs>
+          </w:pPr>
+          <w:hyperlink w:history="1" w:anchor="_Toc18">
+            <w:r>
+              <w:t xml:space="preserve">7. 대표 화면</w:t>
+            </w:r>
+            <w:r>
+              <w:tab/>
+            </w:r>
+            <w:r>
+              <w:fldChar w:fldCharType="begin" w:dirty="true"/>
+              <w:instrText xml:space="preserve">PAGEREF _Toc18 \h</w:instrText>
+              <w:fldChar w:fldCharType="separate"/>
+              <w:fldChar w:fldCharType="end"/>
+            </w:r>
+          </w:hyperlink>
+        </w:p>
+        <w:p>
+          <w:pPr>
+            <w:pStyle w:val="TOC2"/>
+            <w:tabs>
+              <w:tab w:val="right" w:pos="9026" w:leader="dot"/>
+            </w:tabs>
+            <w:ind w:left="220"/>
+          </w:pPr>
+          <w:hyperlink w:history="1" w:anchor="_Toc19">
+            <w:r>
+              <w:t xml:space="preserve">7.1 운영 클라이언트 (VMS) 메인 화면</w:t>
+            </w:r>
+            <w:r>
+              <w:tab/>
+            </w:r>
+            <w:r>
+              <w:fldChar w:fldCharType="begin" w:dirty="true"/>
+              <w:instrText xml:space="preserve">PAGEREF _Toc19 \h</w:instrText>
+              <w:fldChar w:fldCharType="separate"/>
+              <w:fldChar w:fldCharType="end"/>
+            </w:r>
+          </w:hyperlink>
+        </w:p>
+        <w:p>
+          <w:pPr>
+            <w:pStyle w:val="TOC2"/>
+            <w:tabs>
+              <w:tab w:val="right" w:pos="9026" w:leader="dot"/>
+            </w:tabs>
+            <w:ind w:left="220"/>
+          </w:pPr>
+          <w:hyperlink w:history="1" w:anchor="_Toc20">
+            <w:r>
+              <w:t xml:space="preserve">7.2 비전 설정 (VMS.VisionSetup) 워크스페이스</w:t>
+            </w:r>
+            <w:r>
+              <w:tab/>
+            </w:r>
+            <w:r>
+              <w:fldChar w:fldCharType="begin" w:dirty="true"/>
+              <w:instrText xml:space="preserve">PAGEREF _Toc20 \h</w:instrText>
+              <w:fldChar w:fldCharType="separate"/>
+              <w:fldChar w:fldCharType="end"/>
+            </w:r>
+          </w:hyperlink>
+        </w:p>
+        <w:p>
+          <w:pPr>
+            <w:pStyle w:val="TOC2"/>
+            <w:tabs>
+              <w:tab w:val="right" w:pos="9026" w:leader="dot"/>
+            </w:tabs>
+            <w:ind w:left="220"/>
+          </w:pPr>
+          <w:hyperlink w:history="1" w:anchor="_Toc21">
+            <w:r>
+              <w:t xml:space="preserve">7.3 시스템 설정 마법사 (VMS.AppSetup)</w:t>
+            </w:r>
+            <w:r>
+              <w:tab/>
+            </w:r>
+            <w:r>
+              <w:fldChar w:fldCharType="begin" w:dirty="true"/>
+              <w:instrText xml:space="preserve">PAGEREF _Toc21 \h</w:instrText>
+              <w:fldChar w:fldCharType="separate"/>
+              <w:fldChar w:fldCharType="end"/>
+            </w:r>
+          </w:hyperlink>
+        </w:p>
+        <w:p>
+          <w:pPr>
+            <w:pStyle w:val="TOC1"/>
+            <w:tabs>
+              <w:tab w:val="right" w:pos="9026" w:leader="dot"/>
+            </w:tabs>
+          </w:pPr>
+          <w:hyperlink w:history="1" w:anchor="_Toc22">
+            <w:r>
+              <w:t xml:space="preserve">문서 이력</w:t>
+            </w:r>
+            <w:r>
+              <w:tab/>
+            </w:r>
+            <w:r>
+              <w:fldChar w:fldCharType="begin" w:dirty="true"/>
+              <w:instrText xml:space="preserve">PAGEREF _Toc22 \h</w:instrText>
+              <w:fldChar w:fldCharType="separate"/>
+              <w:fldChar w:fldCharType="end"/>
+            </w:r>
+          </w:hyperlink>
         </w:p>
         <w:p>
           <w:r>
@@ -727,9 +1224,11 @@
       <w:pPr>
         <w:pStyle w:val="Heading1"/>
       </w:pPr>
+      <w:bookmarkStart w:name="_Toc2" w:id="2"/>
       <w:r>
         <w:t xml:space="preserve">1. 제품 개요</w:t>
       </w:r>
+      <w:bookmarkEnd w:id="2"/>
     </w:p>
     <w:p>
       <w:pPr>
@@ -751,9 +1250,11 @@
       <w:pPr>
         <w:pStyle w:val="Heading2"/>
       </w:pPr>
+      <w:bookmarkStart w:name="_Toc3" w:id="3"/>
       <w:r>
         <w:t xml:space="preserve">1.1 주요 특징</w:t>
       </w:r>
+      <w:bookmarkEnd w:id="3"/>
     </w:p>
     <w:p>
       <w:pPr>
@@ -786,7 +1287,7 @@
           <w:sz w:val="21"/>
           <w:szCs w:val="21"/>
         </w:rPr>
-        <w:t xml:space="preserve">15개 카테고리 39종의 비전 도구 및 ROI(검사 영역) 지정(Rectangle/RectAffine/Circle/Ellipse/Polygon 등) 제공</w:t>
+        <w:t xml:space="preserve">15개 카테고리 40종의 비전 도구 및 ROI(검사 영역) 지정(Rectangle/RectAffine/Circle/Ellipse/Polygon 등) 제공</w:t>
       </w:r>
     </w:p>
     <w:p>
@@ -861,17 +1362,21 @@
       <w:pPr>
         <w:pStyle w:val="Heading1"/>
       </w:pPr>
+      <w:bookmarkStart w:name="_Toc4" w:id="4"/>
       <w:r>
         <w:t xml:space="preserve">2. 목적 및 적용 범위</w:t>
       </w:r>
+      <w:bookmarkEnd w:id="4"/>
     </w:p>
     <w:p>
       <w:pPr>
         <w:pStyle w:val="Heading2"/>
       </w:pPr>
+      <w:bookmarkStart w:name="_Toc5" w:id="5"/>
       <w:r>
         <w:t xml:space="preserve">2.1 목적</w:t>
       </w:r>
+      <w:bookmarkEnd w:id="5"/>
     </w:p>
     <w:p>
       <w:pPr>
@@ -885,9 +1390,11 @@
       <w:pPr>
         <w:pStyle w:val="Heading2"/>
       </w:pPr>
+      <w:bookmarkStart w:name="_Toc6" w:id="6"/>
       <w:r>
         <w:t xml:space="preserve">2.2 적용 범위</w:t>
       </w:r>
+      <w:bookmarkEnd w:id="6"/>
     </w:p>
     <w:p>
       <w:pPr>
@@ -916,9 +1423,11 @@
       <w:pPr>
         <w:pStyle w:val="Heading1"/>
       </w:pPr>
+      <w:bookmarkStart w:name="_Toc7" w:id="7"/>
       <w:r>
         <w:t xml:space="preserve">3. 제품 구성</w:t>
       </w:r>
+      <w:bookmarkEnd w:id="7"/>
     </w:p>
     <w:p>
       <w:pPr>
@@ -1484,17 +1993,21 @@
       <w:pPr>
         <w:pStyle w:val="Heading1"/>
       </w:pPr>
+      <w:bookmarkStart w:name="_Toc8" w:id="8"/>
       <w:r>
         <w:t xml:space="preserve">4. 동작 환경 및 요구사항</w:t>
       </w:r>
+      <w:bookmarkEnd w:id="8"/>
     </w:p>
     <w:p>
       <w:pPr>
         <w:pStyle w:val="Heading2"/>
       </w:pPr>
+      <w:bookmarkStart w:name="_Toc9" w:id="9"/>
       <w:r>
         <w:t xml:space="preserve">4.1 하드웨어 요구사항</w:t>
       </w:r>
+      <w:bookmarkEnd w:id="9"/>
     </w:p>
     <w:tbl>
       <w:tblPr>
@@ -1986,9 +2499,11 @@
       <w:pPr>
         <w:pStyle w:val="Heading2"/>
       </w:pPr>
+      <w:bookmarkStart w:name="_Toc10" w:id="10"/>
       <w:r>
         <w:t xml:space="preserve">4.2 소프트웨어 요구사항</w:t>
       </w:r>
+      <w:bookmarkEnd w:id="10"/>
     </w:p>
     <w:p>
       <w:pPr>
@@ -2045,9 +2560,11 @@
       <w:pPr>
         <w:pStyle w:val="Heading2"/>
       </w:pPr>
+      <w:bookmarkStart w:name="_Toc11" w:id="11"/>
       <w:r>
         <w:t xml:space="preserve">4.3 주요 사용 라이브러리</w:t>
       </w:r>
+      <w:bookmarkEnd w:id="11"/>
     </w:p>
     <w:p>
       <w:pPr>
@@ -3050,9 +3567,11 @@
       <w:pPr>
         <w:pStyle w:val="Heading1"/>
       </w:pPr>
+      <w:bookmarkStart w:name="_Toc12" w:id="12"/>
       <w:r>
         <w:t xml:space="preserve">5. 설치 및 실행 개요</w:t>
       </w:r>
+      <w:bookmarkEnd w:id="12"/>
     </w:p>
     <w:p>
       <w:pPr>
@@ -3139,9 +3658,11 @@
       <w:pPr>
         <w:pStyle w:val="Heading1"/>
       </w:pPr>
+      <w:bookmarkStart w:name="_Toc13" w:id="13"/>
       <w:r>
         <w:t xml:space="preserve">6. 기능 명세 (Function List)</w:t>
       </w:r>
+      <w:bookmarkEnd w:id="13"/>
     </w:p>
     <w:p>
       <w:pPr>
@@ -3155,9 +3676,11 @@
       <w:pPr>
         <w:pStyle w:val="Heading2"/>
       </w:pPr>
+      <w:bookmarkStart w:name="_Toc14" w:id="14"/>
       <w:r>
         <w:t xml:space="preserve">6.1 시스템 설정 — VMS.AppSetup</w:t>
       </w:r>
+      <w:bookmarkEnd w:id="14"/>
     </w:p>
     <w:tbl>
       <w:tblPr>
@@ -3778,9 +4301,11 @@
       <w:pPr>
         <w:pStyle w:val="Heading2"/>
       </w:pPr>
+      <w:bookmarkStart w:name="_Toc15" w:id="15"/>
       <w:r>
         <w:t xml:space="preserve">6.2 운영 클라이언트 — VMS (메인 화면)</w:t>
       </w:r>
+      <w:bookmarkEnd w:id="15"/>
     </w:p>
     <w:p>
       <w:pPr>
@@ -7657,9 +8182,11 @@
       <w:pPr>
         <w:pStyle w:val="Heading2"/>
       </w:pPr>
+      <w:bookmarkStart w:name="_Toc16" w:id="16"/>
       <w:r>
         <w:t xml:space="preserve">6.3 비전 설정 — VMS.VisionSetup</w:t>
       </w:r>
+      <w:bookmarkEnd w:id="16"/>
     </w:p>
     <w:p>
       <w:pPr>
@@ -9633,7 +10160,7 @@
         <w:pStyle w:val="Heading3"/>
       </w:pPr>
       <w:r>
-        <w:t xml:space="preserve">6.3.4 비전 도구 팔레트 (15 카테고리 · 39종)</w:t>
+        <w:t xml:space="preserve">6.3.4 비전 도구 팔레트 (15 카테고리 · 40종)</w:t>
       </w:r>
     </w:p>
     <w:tbl>
@@ -10735,7 +11262,7 @@
                 <w:sz w:val="19"/>
                 <w:szCs w:val="19"/>
               </w:rPr>
-              <w:t xml:space="preserve">3D 측정 — PointCloud Deviation / Height Slicer / Plane Fit / 3D Geometry (4종)</w:t>
+              <w:t xml:space="preserve">3D 측정 — PointCloud Deviation / Height Slicer / Plane Fit / 3D Geometry / PointCloud Line Fit (5종)</w:t>
             </w:r>
           </w:p>
         </w:tc>
@@ -11235,9 +11762,11 @@
       <w:pPr>
         <w:pStyle w:val="Heading2"/>
       </w:pPr>
+      <w:bookmarkStart w:name="_Toc17" w:id="17"/>
       <w:r>
         <w:t xml:space="preserve">6.4 관리/MES 웹 — BODA.VMS.Web (선택 연동)</w:t>
       </w:r>
+      <w:bookmarkEnd w:id="17"/>
     </w:p>
     <w:tbl>
       <w:tblPr>
@@ -12059,9 +12588,11 @@
       <w:pPr>
         <w:pStyle w:val="Heading1"/>
       </w:pPr>
+      <w:bookmarkStart w:name="_Toc18" w:id="18"/>
       <w:r>
         <w:t xml:space="preserve">7. 대표 화면</w:t>
       </w:r>
+      <w:bookmarkEnd w:id="18"/>
     </w:p>
     <w:p>
       <w:pPr>
@@ -12075,9 +12606,11 @@
       <w:pPr>
         <w:pStyle w:val="Heading2"/>
       </w:pPr>
+      <w:bookmarkStart w:name="_Toc19" w:id="19"/>
       <w:r>
         <w:t xml:space="preserve">7.1 운영 클라이언트 (VMS) 메인 화면</w:t>
       </w:r>
+      <w:bookmarkEnd w:id="19"/>
     </w:p>
     <w:p>
       <w:pPr>
@@ -12089,7 +12622,7 @@
           <wp:inline distT="0" distB="0" distL="0" distR="0">
             <wp:extent cx="5715000" cy="3105150"/>
             <wp:effectExtent t="0" r="0" b="0" l="0"/>
-            <wp:docPr id="1" name="01_vms_main.png" descr="01_vms_main.png" title="01_vms_main.png"/>
+            <wp:docPr id="2" name="01_vms_main.png" descr="01_vms_main.png" title="01_vms_main.png"/>
             <wp:cNvGraphicFramePr>
               <a:graphicFrameLocks xmlns:a="http://schemas.openxmlformats.org/drawingml/2006/main" noChangeAspect="1"/>
             </wp:cNvGraphicFramePr>
@@ -12145,9 +12678,11 @@
       <w:pPr>
         <w:pStyle w:val="Heading2"/>
       </w:pPr>
+      <w:bookmarkStart w:name="_Toc20" w:id="20"/>
       <w:r>
         <w:t xml:space="preserve">7.2 비전 설정 (VMS.VisionSetup) 워크스페이스</w:t>
       </w:r>
+      <w:bookmarkEnd w:id="20"/>
     </w:p>
     <w:p>
       <w:pPr>
@@ -12159,7 +12694,7 @@
           <wp:inline distT="0" distB="0" distL="0" distR="0">
             <wp:extent cx="5715000" cy="3438525"/>
             <wp:effectExtent t="0" r="0" b="0" l="0"/>
-            <wp:docPr id="1" name="v3/vs/full_main_scene.png" descr="v3/vs/full_main_scene.png" title="v3/vs/full_main_scene.png"/>
+            <wp:docPr id="3" name="v3/vs/full_main_scene.png" descr="v3/vs/full_main_scene.png" title="v3/vs/full_main_scene.png"/>
             <wp:cNvGraphicFramePr>
               <a:graphicFrameLocks xmlns:a="http://schemas.openxmlformats.org/drawingml/2006/main" noChangeAspect="1"/>
             </wp:cNvGraphicFramePr>
@@ -12208,16 +12743,18 @@
           <w:sz w:val="18"/>
           <w:szCs w:val="18"/>
         </w:rPr>
-        <w:t xml:space="preserve">그림 7-2. 비전 설정 — 카메라/Steps/Tool Palette(15 카테고리 39종), Tool Workspace, ROI 도구(Select/Rectangle/RectAffine/Circle/Ellipse/Polygon) 및 이미지 뷰</w:t>
+        <w:t xml:space="preserve">그림 7-2. 비전 설정 — 카메라/Steps/Tool Palette(15 카테고리 40종), Tool Workspace, ROI 도구(Select/Rectangle/RectAffine/Circle/Ellipse/Polygon) 및 이미지 뷰</w:t>
       </w:r>
     </w:p>
     <w:p>
       <w:pPr>
         <w:pStyle w:val="Heading2"/>
       </w:pPr>
+      <w:bookmarkStart w:name="_Toc21" w:id="21"/>
       <w:r>
         <w:t xml:space="preserve">7.3 시스템 설정 마법사 (VMS.AppSetup)</w:t>
       </w:r>
+      <w:bookmarkEnd w:id="21"/>
     </w:p>
     <w:p>
       <w:pPr>
@@ -12229,7 +12766,7 @@
           <wp:inline distT="0" distB="0" distL="0" distR="0">
             <wp:extent cx="4000500" cy="3419475"/>
             <wp:effectExtent t="0" r="0" b="0" l="0"/>
-            <wp:docPr id="1" name="02_appsetup_welcome.png" descr="02_appsetup_welcome.png" title="02_appsetup_welcome.png"/>
+            <wp:docPr id="4" name="02_appsetup_welcome.png" descr="02_appsetup_welcome.png" title="02_appsetup_welcome.png"/>
             <wp:cNvGraphicFramePr>
               <a:graphicFrameLocks xmlns:a="http://schemas.openxmlformats.org/drawingml/2006/main" noChangeAspect="1"/>
             </wp:cNvGraphicFramePr>
@@ -12290,9 +12827,11 @@
       <w:pPr>
         <w:pStyle w:val="Heading1"/>
       </w:pPr>
+      <w:bookmarkStart w:name="_Toc22" w:id="22"/>
       <w:r>
         <w:t xml:space="preserve">문서 이력</w:t>
       </w:r>
+      <w:bookmarkEnd w:id="22"/>
     </w:p>
     <w:tbl>
       <w:tblPr>
@@ -12512,8 +13051,8 @@
       </w:tr>
     </w:tbl>
     <w:sectPr>
-      <w:headerReference w:type="default" r:id="rId7"/>
-      <w:footerReference w:type="default" r:id="rId8"/>
+      <w:headerReference w:type="default" r:id="rId6"/>
+      <w:footerReference w:type="default" r:id="rId7"/>
       <w:pgSz w:w="11906" w:h="16838" w:orient="portrait"/>
       <w:pgMar w:top="1440" w:right="1440" w:bottom="1440" w:left="1440" w:header="708" w:footer="708" w:gutter="0"/>
       <w:pgNumType/>
@@ -12521,10 +13060,6 @@
     </w:sectPr>
   </w:body>
 </w:document>
-</file>
-
-<file path=word/comments.xml><?xml version="1.0" encoding="utf-8"?>
-<w:comments xmlns:cx="http://schemas.microsoft.com/office/drawing/2014/chartex" xmlns:cx1="http://schemas.microsoft.com/office/drawing/2015/9/8/chartex" xmlns:cx2="http://schemas.microsoft.com/office/drawing/2015/10/21/chartex" xmlns:cx3="http://schemas.microsoft.com/office/drawing/2016/5/9/chartex" xmlns:cx4="http://schemas.microsoft.com/office/drawing/2016/5/10/chartex" xmlns:cx5="http://schemas.microsoft.com/office/drawing/2016/5/11/chartex" xmlns:cx6="http://schemas.microsoft.com/office/drawing/2016/5/12/chartex" xmlns:cx7="http://schemas.microsoft.com/office/drawing/2016/5/13/chartex" xmlns:cx8="http://schemas.microsoft.com/office/drawing/2016/5/14/chartex" xmlns:mc="http://schemas.openxmlformats.org/markup-compatibility/2006" xmlns:aink="http://schemas.microsoft.com/office/drawing/2016/ink" xmlns:am3d="http://schemas.microsoft.com/office/drawing/2017/model3d" xmlns:o="urn:schemas-microsoft-com:office:office" xmlns:r="http://schemas.openxmlformats.org/officeDocument/2006/relationships" xmlns:m="http://schemas.openxmlformats.org/officeDocument/2006/math" xmlns:v="urn:schemas-microsoft-com:vml" xmlns:wp14="http://schemas.microsoft.com/office/word/2010/wordprocessingDrawing" xmlns:wp="http://schemas.openxmlformats.org/drawingml/2006/wordprocessingDrawing" xmlns:w10="urn:schemas-microsoft-com:office:word" xmlns:w="http://schemas.openxmlformats.org/wordprocessingml/2006/main" xmlns:w14="http://schemas.microsoft.com/office/word/2010/wordml" xmlns:w15="http://schemas.microsoft.com/office/word/2012/wordml" xmlns:w16cex="http://schemas.microsoft.com/office/word/2018/wordml/cex" xmlns:w16cid="http://schemas.microsoft.com/office/word/2016/wordml/cid" xmlns:w16="http://schemas.microsoft.com/office/word/2018/wordml" xmlns:w16sdtdh="http://schemas.microsoft.com/office/word/2020/wordml/sdtdatahash" xmlns:w16se="http://schemas.microsoft.com/office/word/2015/wordml/symex" xmlns:wpg="http://schemas.microsoft.com/office/word/2010/wordprocessingGroup" xmlns:wpi="http://schemas.microsoft.com/office/word/2010/wordprocessingInk" xmlns:wne="http://schemas.microsoft.com/office/word/2006/wordml" xmlns:wps="http://schemas.microsoft.com/office/word/2010/wordprocessingShape"/>
 </file>
 
 <file path=word/endnotes.xml><?xml version="1.0" encoding="utf-8"?>
@@ -12671,7 +13206,7 @@
 <w:numbering xmlns:wpc="http://schemas.microsoft.com/office/word/2010/wordprocessingCanvas" xmlns:mc="http://schemas.openxmlformats.org/markup-compatibility/2006" xmlns:o="urn:schemas-microsoft-com:office:office" xmlns:r="http://schemas.openxmlformats.org/officeDocument/2006/relationships" xmlns:m="http://schemas.openxmlformats.org/officeDocument/2006/math" xmlns:v="urn:schemas-microsoft-com:vml" xmlns:wp14="http://schemas.microsoft.com/office/word/2010/wordprocessingDrawing" xmlns:wp="http://schemas.openxmlformats.org/drawingml/2006/wordprocessingDrawing" xmlns:w10="urn:schemas-microsoft-com:office:word" xmlns:w="http://schemas.openxmlformats.org/wordprocessingml/2006/main" xmlns:w14="http://schemas.microsoft.com/office/word/2010/wordml" xmlns:w15="http://schemas.microsoft.com/office/word/2012/wordml" xmlns:wpg="http://schemas.microsoft.com/office/word/2010/wordprocessingGroup" xmlns:wpi="http://schemas.microsoft.com/office/word/2010/wordprocessingInk" xmlns:wne="http://schemas.microsoft.com/office/word/2006/wordml" xmlns:wps="http://schemas.microsoft.com/office/word/2010/wordprocessingShape" mc:Ignorable="w14 w15 wp14">
   <w:abstractNum w:abstractNumId="1" w15:restartNumberingAfterBreak="0">
     <w:multiLevelType w:val="hybridMultilevel"/>
-    <w:lvl w:ilvl="0" w15:tentative="1">
+    <w:lvl w:ilvl="0" w:tentative="1">
       <w:start w:val="1"/>
       <w:numFmt w:val="bullet"/>
       <w:lvlText w:val="●"/>
@@ -12680,7 +13215,7 @@
         <w:ind w:left="720" w:hanging="360"/>
       </w:pPr>
     </w:lvl>
-    <w:lvl w:ilvl="1" w15:tentative="1">
+    <w:lvl w:ilvl="1" w:tentative="1">
       <w:start w:val="1"/>
       <w:numFmt w:val="bullet"/>
       <w:lvlText w:val="○"/>
@@ -12689,7 +13224,7 @@
         <w:ind w:left="1440" w:hanging="360"/>
       </w:pPr>
     </w:lvl>
-    <w:lvl w:ilvl="2" w15:tentative="1">
+    <w:lvl w:ilvl="2" w:tentative="1">
       <w:start w:val="1"/>
       <w:numFmt w:val="bullet"/>
       <w:lvlText w:val="■"/>
@@ -12698,7 +13233,7 @@
         <w:ind w:left="2160" w:hanging="360"/>
       </w:pPr>
     </w:lvl>
-    <w:lvl w:ilvl="3" w15:tentative="1">
+    <w:lvl w:ilvl="3" w:tentative="1">
       <w:start w:val="1"/>
       <w:numFmt w:val="bullet"/>
       <w:lvlText w:val="●"/>
@@ -12707,7 +13242,7 @@
         <w:ind w:left="2880" w:hanging="360"/>
       </w:pPr>
     </w:lvl>
-    <w:lvl w:ilvl="4" w15:tentative="1">
+    <w:lvl w:ilvl="4" w:tentative="1">
       <w:start w:val="1"/>
       <w:numFmt w:val="bullet"/>
       <w:lvlText w:val="○"/>
@@ -12716,7 +13251,7 @@
         <w:ind w:left="3600" w:hanging="360"/>
       </w:pPr>
     </w:lvl>
-    <w:lvl w:ilvl="5" w15:tentative="1">
+    <w:lvl w:ilvl="5" w:tentative="1">
       <w:start w:val="1"/>
       <w:numFmt w:val="bullet"/>
       <w:lvlText w:val="■"/>
@@ -12725,7 +13260,7 @@
         <w:ind w:left="4320" w:hanging="360"/>
       </w:pPr>
     </w:lvl>
-    <w:lvl w:ilvl="6" w15:tentative="1">
+    <w:lvl w:ilvl="6" w:tentative="1">
       <w:start w:val="1"/>
       <w:numFmt w:val="bullet"/>
       <w:lvlText w:val="●"/>
@@ -12734,7 +13269,7 @@
         <w:ind w:left="5040" w:hanging="360"/>
       </w:pPr>
     </w:lvl>
-    <w:lvl w:ilvl="7" w15:tentative="1">
+    <w:lvl w:ilvl="7" w:tentative="1">
       <w:start w:val="1"/>
       <w:numFmt w:val="bullet"/>
       <w:lvlText w:val="●"/>
@@ -12743,7 +13278,7 @@
         <w:ind w:left="5760" w:hanging="360"/>
       </w:pPr>
     </w:lvl>
-    <w:lvl w:ilvl="8" w15:tentative="1">
+    <w:lvl w:ilvl="8" w:tentative="1">
       <w:start w:val="1"/>
       <w:numFmt w:val="bullet"/>
       <w:lvlText w:val="●"/>
@@ -12755,7 +13290,7 @@
   </w:abstractNum>
   <w:abstractNum w:abstractNumId="2" w15:restartNumberingAfterBreak="0">
     <w:multiLevelType w:val="hybridMultilevel"/>
-    <w:lvl w:ilvl="0" w15:tentative="1">
+    <w:lvl w:ilvl="0" w:tentative="1">
       <w:start w:val="1"/>
       <w:numFmt w:val="bullet"/>
       <w:lvlText w:val="•"/>
@@ -12764,7 +13299,7 @@
         <w:ind w:left="520" w:hanging="260"/>
       </w:pPr>
     </w:lvl>
-    <w:lvl w:ilvl="1" w15:tentative="1">
+    <w:lvl w:ilvl="1" w:tentative="1">
       <w:start w:val="1"/>
       <w:numFmt w:val="bullet"/>
       <w:lvlText w:val="–"/>
@@ -12801,6 +13336,25 @@
     </w:rPrDefault>
     <w:pPrDefault/>
   </w:docDefaults>
+  <w:style w:type="paragraph" w:styleId="Normal" w:default="1">
+    <w:name w:val="Normal"/>
+    <w:qFormat/>
+  </w:style>
+  <w:style w:type="table" w:styleId="TableNormal" w:default="true">
+    <w:name w:val="Normal Table"/>
+    <w:uiPriority w:val="99"/>
+    <w:semiHidden/>
+    <w:unhideWhenUsed/>
+    <w:tblPr>
+      <w:tblInd w:type="dxa" w:w="0"/>
+      <w:tblCellMar>
+        <w:top w:type="dxa" w:w="0"/>
+        <w:left w:type="dxa" w:w="108"/>
+        <w:bottom w:type="dxa" w:w="0"/>
+        <w:right w:type="dxa" w:w="108"/>
+      </w:tblCellMar>
+    </w:tblPr>
+  </w:style>
   <w:style w:type="paragraph" w:styleId="Title">
     <w:name w:val="Title"/>
     <w:basedOn w:val="Normal"/>
@@ -12809,39 +13363,6 @@
     <w:rPr>
       <w:sz w:val="56"/>
       <w:szCs w:val="56"/>
-    </w:rPr>
-  </w:style>
-  <w:style w:type="paragraph" w:styleId="Heading1">
-    <w:name w:val="Heading 1"/>
-    <w:basedOn w:val="Normal"/>
-    <w:next w:val="Normal"/>
-    <w:qFormat/>
-    <w:rPr>
-      <w:color w:val="2E74B5"/>
-      <w:sz w:val="32"/>
-      <w:szCs w:val="32"/>
-    </w:rPr>
-  </w:style>
-  <w:style w:type="paragraph" w:styleId="Heading2">
-    <w:name w:val="Heading 2"/>
-    <w:basedOn w:val="Normal"/>
-    <w:next w:val="Normal"/>
-    <w:qFormat/>
-    <w:rPr>
-      <w:color w:val="2E74B5"/>
-      <w:sz w:val="26"/>
-      <w:szCs w:val="26"/>
-    </w:rPr>
-  </w:style>
-  <w:style w:type="paragraph" w:styleId="Heading3">
-    <w:name w:val="Heading 3"/>
-    <w:basedOn w:val="Normal"/>
-    <w:next w:val="Normal"/>
-    <w:qFormat/>
-    <w:rPr>
-      <w:color w:val="1F4D78"/>
-      <w:sz w:val="24"/>
-      <w:szCs w:val="24"/>
     </w:rPr>
   </w:style>
   <w:style w:type="paragraph" w:styleId="Heading4">
@@ -13027,4 +13548,294 @@
     </w:rPr>
   </w:style>
 </w:styles>
+</file>
+
+<file path=word/theme/theme1.xml><?xml version="1.0" encoding="utf-8"?>
+<a:theme xmlns:a="http://schemas.openxmlformats.org/drawingml/2006/main" name="Office Theme">
+  <a:themeElements>
+    <a:clrScheme name="Office">
+      <a:dk1>
+        <a:sysClr val="windowText" lastClr="000000"/>
+      </a:dk1>
+      <a:lt1>
+        <a:sysClr val="window" lastClr="FFFFFF"/>
+      </a:lt1>
+      <a:dk2>
+        <a:srgbClr val="44546A"/>
+      </a:dk2>
+      <a:lt2>
+        <a:srgbClr val="E7E6E6"/>
+      </a:lt2>
+      <a:accent1>
+        <a:srgbClr val="4472C4"/>
+      </a:accent1>
+      <a:accent2>
+        <a:srgbClr val="ED7D31"/>
+      </a:accent2>
+      <a:accent3>
+        <a:srgbClr val="A5A5A5"/>
+      </a:accent3>
+      <a:accent4>
+        <a:srgbClr val="FFC000"/>
+      </a:accent4>
+      <a:accent5>
+        <a:srgbClr val="5B9BD5"/>
+      </a:accent5>
+      <a:accent6>
+        <a:srgbClr val="70AD47"/>
+      </a:accent6>
+      <a:hlink>
+        <a:srgbClr val="0563C1"/>
+      </a:hlink>
+      <a:folHlink>
+        <a:srgbClr val="954F72"/>
+      </a:folHlink>
+    </a:clrScheme>
+    <a:fontScheme name="Office">
+      <a:majorFont>
+        <a:latin typeface="Calibri Light" panose="020F0302020204030204"/>
+        <a:ea typeface=""/>
+        <a:cs typeface=""/>
+        <a:font script="Jpan" typeface="游ゴシック Light"/>
+        <a:font script="Hang" typeface="맑은 고딕"/>
+        <a:font script="Hans" typeface="等线 Light"/>
+        <a:font script="Hant" typeface="新細明體"/>
+        <a:font script="Arab" typeface="Times New Roman"/>
+        <a:font script="Hebr" typeface="Times New Roman"/>
+        <a:font script="Thai" typeface="Angsana New"/>
+        <a:font script="Ethi" typeface="Nyala"/>
+        <a:font script="Beng" typeface="Vrinda"/>
+        <a:font script="Gujr" typeface="Shruti"/>
+        <a:font script="Khmr" typeface="MoolBoran"/>
+        <a:font script="Knda" typeface="Tunga"/>
+        <a:font script="Guru" typeface="Raavi"/>
+        <a:font script="Cans" typeface="Euphemia"/>
+        <a:font script="Cher" typeface="Plantagenet Cherokee"/>
+        <a:font script="Yiii" typeface="Microsoft Yi Baiti"/>
+        <a:font script="Tibt" typeface="Microsoft Himalaya"/>
+        <a:font script="Thaa" typeface="MV Boli"/>
+        <a:font script="Deva" typeface="Mangal"/>
+        <a:font script="Telu" typeface="Gautami"/>
+        <a:font script="Taml" typeface="Latha"/>
+        <a:font script="Syrc" typeface="Estrangelo Edessa"/>
+        <a:font script="Orya" typeface="Kalinga"/>
+        <a:font script="Mlym" typeface="Kartika"/>
+        <a:font script="Laoo" typeface="DokChampa"/>
+        <a:font script="Sinh" typeface="Iskoola Pota"/>
+        <a:font script="Mong" typeface="Mongolian Baiti"/>
+        <a:font script="Viet" typeface="Times New Roman"/>
+        <a:font script="Uigh" typeface="Microsoft Uighur"/>
+        <a:font script="Geor" typeface="Sylfaen"/>
+        <a:font script="Armn" typeface="Arial"/>
+        <a:font script="Bugi" typeface="Leelawadee UI"/>
+        <a:font script="Bopo" typeface="Microsoft JhengHei"/>
+        <a:font script="Java" typeface="Javanese Text"/>
+        <a:font script="Lisu" typeface="Segoe UI"/>
+        <a:font script="Mymr" typeface="Myanmar Text"/>
+        <a:font script="Nkoo" typeface="Ebrima"/>
+        <a:font script="Olck" typeface="Nirmala UI"/>
+        <a:font script="Osma" typeface="Ebrima"/>
+        <a:font script="Phag" typeface="Phagspa"/>
+        <a:font script="Syrn" typeface="Estrangelo Edessa"/>
+        <a:font script="Syrj" typeface="Estrangelo Edessa"/>
+        <a:font script="Syre" typeface="Estrangelo Edessa"/>
+        <a:font script="Sora" typeface="Nirmala UI"/>
+        <a:font script="Tale" typeface="Microsoft Tai Le"/>
+        <a:font script="Talu" typeface="Microsoft New Tai Lue"/>
+        <a:font script="Tfng" typeface="Ebrima"/>
+      </a:majorFont>
+      <a:minorFont>
+        <a:latin typeface="Calibri" panose="020F0502020204030204"/>
+        <a:ea typeface=""/>
+        <a:cs typeface=""/>
+        <a:font script="Jpan" typeface="游明朝"/>
+        <a:font script="Hang" typeface="맑은 고딕"/>
+        <a:font script="Hans" typeface="等线"/>
+        <a:font script="Hant" typeface="新細明體"/>
+        <a:font script="Arab" typeface="Arial"/>
+        <a:font script="Hebr" typeface="Arial"/>
+        <a:font script="Thai" typeface="Cordia New"/>
+        <a:font script="Ethi" typeface="Nyala"/>
+        <a:font script="Beng" typeface="Vrinda"/>
+        <a:font script="Gujr" typeface="Shruti"/>
+        <a:font script="Khmr" typeface="DaunPenh"/>
+        <a:font script="Knda" typeface="Tunga"/>
+        <a:font script="Guru" typeface="Raavi"/>
+        <a:font script="Cans" typeface="Euphemia"/>
+        <a:font script="Cher" typeface="Plantagenet Cherokee"/>
+        <a:font script="Yiii" typeface="Microsoft Yi Baiti"/>
+        <a:font script="Tibt" typeface="Microsoft Himalaya"/>
+        <a:font script="Thaa" typeface="MV Boli"/>
+        <a:font script="Deva" typeface="Mangal"/>
+        <a:font script="Telu" typeface="Gautami"/>
+        <a:font script="Taml" typeface="Latha"/>
+        <a:font script="Syrc" typeface="Estrangelo Edessa"/>
+        <a:font script="Orya" typeface="Kalinga"/>
+        <a:font script="Mlym" typeface="Kartika"/>
+        <a:font script="Laoo" typeface="DokChampa"/>
+        <a:font script="Sinh" typeface="Iskoola Pota"/>
+        <a:font script="Mong" typeface="Mongolian Baiti"/>
+        <a:font script="Viet" typeface="Arial"/>
+        <a:font script="Uigh" typeface="Microsoft Uighur"/>
+        <a:font script="Geor" typeface="Sylfaen"/>
+        <a:font script="Armn" typeface="Arial"/>
+        <a:font script="Bugi" typeface="Leelawadee UI"/>
+        <a:font script="Bopo" typeface="Microsoft JhengHei"/>
+        <a:font script="Java" typeface="Javanese Text"/>
+        <a:font script="Lisu" typeface="Segoe UI"/>
+        <a:font script="Mymr" typeface="Myanmar Text"/>
+        <a:font script="Nkoo" typeface="Ebrima"/>
+        <a:font script="Olck" typeface="Nirmala UI"/>
+        <a:font script="Osma" typeface="Ebrima"/>
+        <a:font script="Phag" typeface="Phagspa"/>
+        <a:font script="Syrn" typeface="Estrangelo Edessa"/>
+        <a:font script="Syrj" typeface="Estrangelo Edessa"/>
+        <a:font script="Syre" typeface="Estrangelo Edessa"/>
+        <a:font script="Sora" typeface="Nirmala UI"/>
+        <a:font script="Tale" typeface="Microsoft Tai Le"/>
+        <a:font script="Talu" typeface="Microsoft New Tai Lue"/>
+        <a:font script="Tfng" typeface="Ebrima"/>
+      </a:minorFont>
+    </a:fontScheme>
+    <a:fmtScheme name="Office">
+      <a:fillStyleLst>
+        <a:solidFill>
+          <a:schemeClr val="phClr"/>
+        </a:solidFill>
+        <a:gradFill rotWithShape="true">
+          <a:gsLst>
+            <a:gs pos="0">
+              <a:schemeClr val="phClr">
+                <a:lumMod val="110000"/>
+                <a:satMod val="105000"/>
+                <a:tint val="67000"/>
+              </a:schemeClr>
+            </a:gs>
+            <a:gs pos="50000">
+              <a:schemeClr val="phClr">
+                <a:lumMod val="105000"/>
+                <a:satMod val="103000"/>
+                <a:tint val="73000"/>
+              </a:schemeClr>
+            </a:gs>
+            <a:gs pos="100000">
+              <a:schemeClr val="phClr">
+                <a:lumMod val="105000"/>
+                <a:satMod val="109000"/>
+                <a:tint val="81000"/>
+              </a:schemeClr>
+            </a:gs>
+          </a:gsLst>
+          <a:lin ang="5400000" scaled="false"/>
+        </a:gradFill>
+        <a:gradFill rotWithShape="true">
+          <a:gsLst>
+            <a:gs pos="0">
+              <a:schemeClr val="phClr">
+                <a:satMod val="103000"/>
+                <a:lumMod val="102000"/>
+                <a:tint val="94000"/>
+              </a:schemeClr>
+            </a:gs>
+            <a:gs pos="50000">
+              <a:schemeClr val="phClr">
+                <a:satMod val="110000"/>
+                <a:lumMod val="100000"/>
+                <a:shade val="100000"/>
+              </a:schemeClr>
+            </a:gs>
+            <a:gs pos="100000">
+              <a:schemeClr val="phClr">
+                <a:lumMod val="99000"/>
+                <a:satMod val="120000"/>
+                <a:shade val="78000"/>
+              </a:schemeClr>
+            </a:gs>
+          </a:gsLst>
+          <a:lin ang="5400000" scaled="false"/>
+        </a:gradFill>
+      </a:fillStyleLst>
+      <a:lnStyleLst>
+        <a:ln w="6350" cap="flat" cmpd="sng" algn="ctr">
+          <a:solidFill>
+            <a:schemeClr val="phClr"/>
+          </a:solidFill>
+          <a:prstDash val="solid"/>
+          <a:miter lim="800000"/>
+        </a:ln>
+        <a:ln w="12700" cap="flat" cmpd="sng" algn="ctr">
+          <a:solidFill>
+            <a:schemeClr val="phClr"/>
+          </a:solidFill>
+          <a:prstDash val="solid"/>
+          <a:miter lim="800000"/>
+        </a:ln>
+        <a:ln w="19050" cap="flat" cmpd="sng" algn="ctr">
+          <a:solidFill>
+            <a:schemeClr val="phClr"/>
+          </a:solidFill>
+          <a:prstDash val="solid"/>
+          <a:miter lim="800000"/>
+        </a:ln>
+      </a:lnStyleLst>
+      <a:effectStyleLst>
+        <a:effectStyle>
+          <a:effectLst/>
+        </a:effectStyle>
+        <a:effectStyle>
+          <a:effectLst/>
+        </a:effectStyle>
+        <a:effectStyle>
+          <a:effectLst>
+            <a:outerShdw blurRad="57150" dist="19050" dir="5400000" algn="ctr" rotWithShape="false">
+              <a:srgbClr val="000000">
+                <a:alpha val="63000"/>
+              </a:srgbClr>
+            </a:outerShdw>
+          </a:effectLst>
+        </a:effectStyle>
+      </a:effectStyleLst>
+      <a:bgFillStyleLst>
+        <a:solidFill>
+          <a:schemeClr val="phClr"/>
+        </a:solidFill>
+        <a:solidFill>
+          <a:schemeClr val="phClr">
+            <a:tint val="95000"/>
+            <a:satMod val="170000"/>
+          </a:schemeClr>
+        </a:solidFill>
+        <a:gradFill rotWithShape="true">
+          <a:gsLst>
+            <a:gs pos="0">
+              <a:schemeClr val="phClr">
+                <a:tint val="93000"/>
+                <a:satMod val="150000"/>
+                <a:shade val="98000"/>
+                <a:lumMod val="102000"/>
+              </a:schemeClr>
+            </a:gs>
+            <a:gs pos="50000">
+              <a:schemeClr val="phClr">
+                <a:tint val="98000"/>
+                <a:satMod val="130000"/>
+                <a:shade val="90000"/>
+                <a:lumMod val="103000"/>
+              </a:schemeClr>
+            </a:gs>
+            <a:gs pos="100000">
+              <a:schemeClr val="phClr">
+                <a:shade val="63000"/>
+                <a:satMod val="120000"/>
+              </a:schemeClr>
+            </a:gs>
+          </a:gsLst>
+          <a:lin ang="5400000" scaled="false"/>
+        </a:gradFill>
+      </a:bgFillStyleLst>
+    </a:fmtScheme>
+  </a:themeElements>
+  <a:objectDefaults/>
+  <a:extraClrSchemeLst/>
+</a:theme>
 </file>
</xml_diff>

<commit_message>
chore(release): v1.44.0 — 버전 bump + 매뉴얼 반영(§71·§75·§76)
- Directory.Build.props 1.43.1 → 1.44.0 (#570 AI 학습 도구 제거)
- 설치 구성 선택 그림 71_msi_weboption.png 를 릴리즈 MSI 로 재캡처(체크박스 하나)
- §13.4 대상 SW · 머리글 · 제품설명서 제품 버전 1.44.0 (제품설명서는 학습 도구 행 없음)
- docx/PDF 재생성 202쪽 · 그림 151장, 장부 §76 · §71/§75 반영 완료 · README 기준선

Co-Authored-By: Claude Opus 5.5 <noreply@anthropic.com>
</commit_message>
<xml_diff>
--- a/docs/gs/VMS_제품설명서_v1.0.docx
+++ b/docs/gs/VMS_제품설명서_v1.0.docx
@@ -290,7 +290,7 @@
                 <w:sz w:val="19"/>
                 <w:szCs w:val="19"/>
               </w:rPr>
-              <w:t xml:space="preserve">v1.43.1</w:t>
+              <w:t xml:space="preserve">v1.44.0</w:t>
             </w:r>
           </w:p>
         </w:tc>
@@ -1401,7 +1401,7 @@
         <w:spacing w:after="120" w:line="276"/>
       </w:pPr>
       <w:r>
-        <w:t xml:space="preserve">적용 범위는 VMS 데스크톱 제품군(운영 클라이언트 VMS, 시스템 설정 VMS.AppSetup, 비전 설정 VMS.VisionSetup)과 이와 연동되는 BODA.VMS.Web(관리/MES) 서버를 포함한다. 딥러닝 모델을 만드는 AI 학습 도구(VMS.DeepLearning)는 선택 설치 구성 요소로서 본 인증 범위에 포함하지 않으며, 제품은 학습된 ONNX 모델을 사용한 추론 검사 기능만 포함한다.</w:t>
+        <w:t xml:space="preserve">적용 범위는 VMS 데스크톱 제품군(운영 클라이언트 VMS, 시스템 설정 VMS.AppSetup, 비전 설정 VMS.VisionSetup)과 이와 연동되는 BODA.VMS.Web(관리/MES) 서버를 포함한다. 제품은 학습된 ONNX 모델을 사용한 추론 검사 기능만 포함하며, 모델을 만드는 학습 기능은 별도 플랫폼(BODA.VMS.MLOps)의 몫으로 본 인증 범위에 포함하지 않는다.</w:t>
       </w:r>
     </w:p>
     <w:p>
@@ -1754,7 +1754,7 @@
                 <w:sz w:val="19"/>
                 <w:szCs w:val="19"/>
               </w:rPr>
-              <w:t xml:space="preserve">(선택 구성) VMS.DeepLearning</w:t>
+              <w:t xml:space="preserve">(선택 구성) BODA.VMS.MLOps</w:t>
             </w:r>
           </w:p>
         </w:tc>
@@ -1785,7 +1785,7 @@
                 <w:sz w:val="19"/>
                 <w:szCs w:val="19"/>
               </w:rPr>
-              <w:t xml:space="preserve">딥러닝 데이터셋 라벨링·학습 도구 — 선택 설치 구성 요소, 인증 범위 외 (인증 제출 빌드 미포함).</w:t>
+              <w:t xml:space="preserve">딥러닝 모델 수집·라벨링·학습·배포를 관리하는 별도 웹 플랫폼(GPU 학습 워커 포함) — 선택 구성 요소, 인증 범위 외 (제품 MSI 미포함, 별도 서버에 설치). 사용자 매뉴얼 9장 참조.</w:t>
             </w:r>
           </w:p>
         </w:tc>
@@ -1820,7 +1820,7 @@
                 <w:sz w:val="19"/>
                 <w:szCs w:val="19"/>
               </w:rPr>
-              <w:t xml:space="preserve">(선택 구성) BODA.VMS.MLOps</w:t>
+              <w:t xml:space="preserve">NativeVision (C++ 가속)</w:t>
             </w:r>
           </w:p>
         </w:tc>
@@ -1851,7 +1851,7 @@
                 <w:sz w:val="19"/>
                 <w:szCs w:val="19"/>
               </w:rPr>
-              <w:t xml:space="preserve">딥러닝 모델 수집·라벨링·학습·배포를 관리하는 별도 웹 플랫폼(GPU 학습 워커 포함) — 선택 구성 요소, 인증 범위 외 (제품 MSI 미포함, 별도 서버에 설치). 사용자 매뉴얼 9장 참조.</w:t>
+              <w:t xml:space="preserve">AVX2/FMA 기반 영상처리 가속 네이티브 라이브러리.</w:t>
             </w:r>
           </w:p>
         </w:tc>
@@ -1886,7 +1886,7 @@
                 <w:sz w:val="19"/>
                 <w:szCs w:val="19"/>
               </w:rPr>
-              <w:t xml:space="preserve">NativeVision (C++ 가속)</w:t>
+              <w:t xml:space="preserve">BODA.VMS.Web (관리/MES)</w:t>
             </w:r>
           </w:p>
         </w:tc>
@@ -1900,72 +1900,6 @@
               <w:right w:val="single" w:color="BFBFBF" w:sz="1"/>
             </w:tcBorders>
             <w:shd w:fill="F4F7FB" w:val="clear"/>
-            <w:tcMar>
-              <w:top w:type="dxa" w:w="60"/>
-              <w:left w:type="dxa" w:w="110"/>
-              <w:bottom w:type="dxa" w:w="60"/>
-              <w:right w:type="dxa" w:w="110"/>
-            </w:tcMar>
-            <w:vAlign w:val="center"/>
-          </w:tcPr>
-          <w:p>
-            <w:pPr>
-              <w:spacing w:after="0" w:line="252"/>
-            </w:pPr>
-            <w:r>
-              <w:rPr>
-                <w:sz w:val="19"/>
-                <w:szCs w:val="19"/>
-              </w:rPr>
-              <w:t xml:space="preserve">AVX2/FMA 기반 영상처리 가속 네이티브 라이브러리.</w:t>
-            </w:r>
-          </w:p>
-        </w:tc>
-      </w:tr>
-      <w:tr>
-        <w:tc>
-          <w:tcPr>
-            <w:tcW w:type="dxa" w:w="2600"/>
-            <w:tcBorders>
-              <w:top w:val="single" w:color="BFBFBF" w:sz="1"/>
-              <w:left w:val="single" w:color="BFBFBF" w:sz="1"/>
-              <w:bottom w:val="single" w:color="BFBFBF" w:sz="1"/>
-              <w:right w:val="single" w:color="BFBFBF" w:sz="1"/>
-            </w:tcBorders>
-            <w:shd w:fill="FFFFFF" w:val="clear"/>
-            <w:tcMar>
-              <w:top w:type="dxa" w:w="60"/>
-              <w:left w:type="dxa" w:w="110"/>
-              <w:bottom w:type="dxa" w:w="60"/>
-              <w:right w:type="dxa" w:w="110"/>
-            </w:tcMar>
-            <w:vAlign w:val="center"/>
-          </w:tcPr>
-          <w:p>
-            <w:pPr>
-              <w:spacing w:after="0" w:line="252"/>
-            </w:pPr>
-            <w:r>
-              <w:rPr>
-                <w:b/>
-                <w:bCs/>
-                <w:sz w:val="19"/>
-                <w:szCs w:val="19"/>
-              </w:rPr>
-              <w:t xml:space="preserve">BODA.VMS.Web (관리/MES)</w:t>
-            </w:r>
-          </w:p>
-        </w:tc>
-        <w:tc>
-          <w:tcPr>
-            <w:tcW w:type="dxa" w:w="6426"/>
-            <w:tcBorders>
-              <w:top w:val="single" w:color="BFBFBF" w:sz="1"/>
-              <w:left w:val="single" w:color="BFBFBF" w:sz="1"/>
-              <w:bottom w:val="single" w:color="BFBFBF" w:sz="1"/>
-              <w:right w:val="single" w:color="BFBFBF" w:sz="1"/>
-            </w:tcBorders>
-            <w:shd w:fill="FFFFFF" w:val="clear"/>
             <w:tcMar>
               <w:top w:type="dxa" w:w="60"/>
               <w:left w:type="dxa" w:w="110"/>

</xml_diff>

<commit_message>
feat(visionsetup): Ensemble 을 도구 팔레트(Judgment)에 추가 + 매뉴얼 6장 Line Fit · Ensemble 절 · VisionSetup 그림 재캡처
GS 재신청 검토에서 찾은 제품 · 매뉴얼 불일치 3건 (장부 §94).

- Ensemble 이 팔레트에만 빠져 있었다(도구 · 설정 · 도움말 · 매뉴얼 부록은 있음) → Judgment 분류 Result 다음에 추가, GetAvailableTools 도 Judgment 로. 팔레트 40종
- GetAvailableTools 에 PointCloud Deviation 이 빠져 직렬화 왕복 테스트가 돌지 않던 것 추가
- 시험: Palette_ListsEveryAvailableTool_ExceptHidden — 팔레트 = 지원 도구 − YOLOv8-seg(숨김)
- 매뉴얼: §6.10 PointCloud Line Fit · §6.12 Ensemble 절 신설(패널 캡처 2장), §5 메인 화면 그림 재캡처(없어진 Deep Learning 메뉴가 보이던 옛 그림) · 메뉴 바 행 · 판정 규칙 표 Ensemble 행 · 템플릿 갤러리 그림 재캡처(YOLOv8-seg 다이어그램), §1 40 종, §7.3 캡션, 제품설명서 40종. docx/PDF 205쪽 · 그림 152장

Co-Authored-By: Claude Opus 5.5 <noreply@anthropic.com>
</commit_message>
<xml_diff>
--- a/docs/gs/VMS_제품설명서_v1.0.docx
+++ b/docs/gs/VMS_제품설명서_v1.0.docx
@@ -1287,7 +1287,7 @@
           <w:sz w:val="21"/>
           <w:szCs w:val="21"/>
         </w:rPr>
-        <w:t xml:space="preserve">15개 카테고리 39종의 비전 도구 및 ROI(검사 영역) 지정(Rectangle/RectAffine/Circle/Ellipse/Polygon 등) 제공</w:t>
+        <w:t xml:space="preserve">15개 카테고리 40종의 비전 도구 및 ROI(검사 영역) 지정(Rectangle/RectAffine/Circle/Ellipse/Polygon 등) 제공</w:t>
       </w:r>
     </w:p>
     <w:p>
@@ -10094,7 +10094,7 @@
         <w:pStyle w:val="Heading3"/>
       </w:pPr>
       <w:r>
-        <w:t xml:space="preserve">6.3.4 비전 도구 팔레트 (15 카테고리 · 39종)</w:t>
+        <w:t xml:space="preserve">6.3.4 비전 도구 팔레트 (15 카테고리 · 40종)</w:t>
       </w:r>
     </w:p>
     <w:tbl>
@@ -11392,7 +11392,7 @@
                 <w:sz w:val="19"/>
                 <w:szCs w:val="19"/>
               </w:rPr>
-              <w:t xml:space="preserve">종합 판정 — Result (1종)</w:t>
+              <w:t xml:space="preserve">종합 판정 — Result / Ensemble (2종, Ensemble 은 딥러닝 판정 결합)</w:t>
             </w:r>
           </w:p>
         </w:tc>
@@ -12626,7 +12626,7 @@
       <w:r>
         <w:drawing>
           <wp:inline distT="0" distB="0" distL="0" distR="0">
-            <wp:extent cx="5715000" cy="3438525"/>
+            <wp:extent cx="5715000" cy="3105150"/>
             <wp:effectExtent t="0" r="0" b="0" l="0"/>
             <wp:docPr id="3" name="v3/vs/full_main_scene.png" descr="v3/vs/full_main_scene.png" title="v3/vs/full_main_scene.png"/>
             <wp:cNvGraphicFramePr>
@@ -12651,7 +12651,7 @@
                   <pic:spPr bwMode="auto">
                     <a:xfrm>
                       <a:off x="0" y="0"/>
-                      <a:ext cx="5715000" cy="3438525"/>
+                      <a:ext cx="5715000" cy="3105150"/>
                     </a:xfrm>
                     <a:prstGeom prst="rect">
                       <a:avLst/>
@@ -12677,7 +12677,7 @@
           <w:sz w:val="18"/>
           <w:szCs w:val="18"/>
         </w:rPr>
-        <w:t xml:space="preserve">그림 7-2. 비전 설정 — 카메라/Steps/Tool Palette(15 카테고리 39종), Tool Workspace, ROI 도구(Select/Rectangle/RectAffine/Circle/Ellipse/Polygon) 및 이미지 뷰</w:t>
+        <w:t xml:space="preserve">그림 7-2. 비전 설정 — 카메라/Steps/Tool Palette(15 카테고리 40종), Tool Workspace, ROI 도구(Select/Rectangle/RectAffine/Circle/Ellipse/Polygon) 및 이미지 뷰</w:t>
       </w:r>
     </w:p>
     <w:p>

</xml_diff>

<commit_message>
chore(release): v1.48.0 — BODA VMS · 확장 옵션 · 매뉴얼 기본 구성 재캡처
- Directory.Build.props 1.48.0 (feat → MINOR) · 동봉 Web 1.12.0 (Web #164 · #165)
- 매뉴얼: 표지(BODA VMS v1.48.0) · 머리글 · §11.5 날짜 2026-10-30, 그림 재캡처(기본 구성 · v1.48.0)
  AppSetup 6 · 고급 설정 토글, VMS 메인 · 컨트롤 15 · 이미지 저장 · 검사 운전 3, VisionSetup 메인 · 장면 38 ·
  도구 패널 7 · 템플릿 갤러리, 웹 39, 설치 창 70/71, 시스템 구성도(학습 플랫폼 · 로봇 삭제), 표지 그림.
  §4.2 · §4.5 카메라 타일 탭 문구(기본 구성은 2D 만). docx/PDF 214쪽 · 그림 183장 · 경고 0.
- 제품설명서 v1.48.0: 표지 · 개요 제품명 BODA VMS, 생성기 따옴표 문법 오류 수정(#603 회귀).
- 캡처 도구: AppSetup 캡처 장면 카메라를 3D 옵션 없을 때 2D(Basler)로, AppSetup 카메라 안내문에서 3D 취득 옵션 문구 삭제,
  capture-msi-weboption.ps1 -WelcomeOut (+ BOM — PowerShell 5.1 한글 창 제목).
- GS 시험 PC 체크리스트: 시작 v1.47.3 → v1.48.0, 기본 구성 라이선스 재발급, 업데이트 리허설 확인 항목.
- 장부 manual_change_history §103 · README 기준선.

Co-Authored-By: Claude Opus 5.5 <noreply@anthropic.com>
Claude-Session: https://claude.ai/code/session_01YPfQivwyB8VR2TwaSYhNUt
</commit_message>
<xml_diff>
--- a/docs/gs/VMS_제품설명서_v1.0.docx
+++ b/docs/gs/VMS_제품설명서_v1.0.docx
@@ -44,7 +44,7 @@
           <w:sz w:val="34"/>
           <w:szCs w:val="34"/>
         </w:rPr>
-        <w:t xml:space="preserve">BODA Vision Management System (VMS)</w:t>
+        <w:t xml:space="preserve">BODA VMS</w:t>
       </w:r>
     </w:p>
     <w:p>
@@ -225,7 +225,7 @@
                 <w:sz w:val="19"/>
                 <w:szCs w:val="19"/>
               </w:rPr>
-              <w:t xml:space="preserve">BODA Vision Management System (VMS)</w:t>
+              <w:t xml:space="preserve">BODA VMS</w:t>
             </w:r>
           </w:p>
         </w:tc>
@@ -290,7 +290,7 @@
                 <w:sz w:val="19"/>
                 <w:szCs w:val="19"/>
               </w:rPr>
-              <w:t xml:space="preserve">v1.47.3</w:t>
+              <w:t xml:space="preserve">v1.48.0</w:t>
             </w:r>
           </w:p>
         </w:tc>
@@ -1235,7 +1235,7 @@
         <w:spacing w:after="120" w:line="276"/>
       </w:pPr>
       <w:r>
-        <w:t xml:space="preserve">BODA Vision Management System(이하 VMS)은 산업 현장의 자동 외관·치수 검사를 위한 머신비전 검사 플랫폼이다. 사용자는 카메라로 취득한 이미지에 비전 도구(전처리, 패턴 매칭, 블롭, 측정, OCR/코드 판독, 딥러닝 등)를 조합한 검사 레시피를 구성하고, 생산 라인에서 자동/수동으로 검사를 실행하여 양품(OK)·불량(NG) 판정과 통계를 관리한다.</w:t>
+        <w:t xml:space="preserve">BODA VMS(이하 VMS)는 산업 현장의 자동 외관·치수 검사를 위한 머신비전 검사 플랫폼이다. 사용자는 카메라로 취득한 이미지에 비전 도구(전처리, 패턴 매칭, 블롭, 측정, OCR/코드 판독, 딥러닝 등)를 조합한 검사 레시피를 구성하고, 생산 라인에서 자동/수동으로 검사를 실행하여 양품(OK)·불량(NG) 판정과 통계를 관리한다.</w:t>
       </w:r>
     </w:p>
     <w:p>
@@ -1401,7 +1401,7 @@
         <w:spacing w:after="120" w:line="276"/>
       </w:pPr>
       <w:r>
-        <w:t xml:space="preserve">적용 범위는 VMS 데스크톱 제품군(운영 클라이언트 VMS, 시스템 설정 VMS.AppSetup, 비전 설정 VMS.VisionSetup)과 이와 연동되는 BODA.VMS.Web(관리/MES) 서버를 포함한다. 제품은 학습된 ONNX 모델을 사용한 추론 검사 기능만 포함하며, 모델을 만드는 학습 기능은 별도 플랫폼(BODA.VMS.MLOps)의 몫으로 본 인증 범위에 포함하지 않는다.</w:t>
+        <w:t xml:space="preserve">적용 범위는 BODA VMS 를 이루는 운영 클라이언트 VMS, 시스템 설정 VMS.AppSetup, 비전 설정 VMS.VisionSetup, 생산 관리 웹 BODA.VMS.Web 이며, 네 구성 요소는 하나의 설치 파일로 제공된다. 딥러닝 검사는 학습된 ONNX 모델 파일을 불러와 추론하는 기능이며, 제품에 모델 학습 기능은 없다.</w:t>
       </w:r>
     </w:p>
     <w:p>
@@ -1653,7 +1653,7 @@
                 <w:sz w:val="19"/>
                 <w:szCs w:val="19"/>
               </w:rPr>
-              <w:t xml:space="preserve">최초 1회 시스템 구성 마법사. 애플리케이션·네트워크·카메라·PLC·로봇·초기 관리자 계정 설정.</w:t>
+              <w:t xml:space="preserve">최초 1회 시스템 구성 마법사. 애플리케이션·네트워크·카메라·PLC·IO 보드·초기 관리자 계정·보안 모드·라이선스 설정.</w:t>
             </w:r>
           </w:p>
         </w:tc>
@@ -1754,7 +1754,7 @@
                 <w:sz w:val="19"/>
                 <w:szCs w:val="19"/>
               </w:rPr>
-              <w:t xml:space="preserve">(선택 구성) BODA.VMS.MLOps</w:t>
+              <w:t xml:space="preserve">NativeVision (C++ 가속)</w:t>
             </w:r>
           </w:p>
         </w:tc>
@@ -1785,7 +1785,7 @@
                 <w:sz w:val="19"/>
                 <w:szCs w:val="19"/>
               </w:rPr>
-              <w:t xml:space="preserve">딥러닝 모델 수집·라벨링·학습·배포를 관리하는 별도 웹 플랫폼(GPU 학습 워커 포함) — 선택 구성 요소, 인증 범위 외 (제품 MSI 미포함, 별도 서버에 설치). 사용자 매뉴얼 9장 참조.</w:t>
+              <w:t xml:space="preserve">AVX2/FMA 기반 영상처리 가속 네이티브 라이브러리.</w:t>
             </w:r>
           </w:p>
         </w:tc>
@@ -1820,7 +1820,7 @@
                 <w:sz w:val="19"/>
                 <w:szCs w:val="19"/>
               </w:rPr>
-              <w:t xml:space="preserve">NativeVision (C++ 가속)</w:t>
+              <w:t xml:space="preserve">BODA.VMS.Web (관리/MES)</w:t>
             </w:r>
           </w:p>
         </w:tc>
@@ -1851,73 +1851,7 @@
                 <w:sz w:val="19"/>
                 <w:szCs w:val="19"/>
               </w:rPr>
-              <w:t xml:space="preserve">AVX2/FMA 기반 영상처리 가속 네이티브 라이브러리.</w:t>
-            </w:r>
-          </w:p>
-        </w:tc>
-      </w:tr>
-      <w:tr>
-        <w:tc>
-          <w:tcPr>
-            <w:tcW w:type="dxa" w:w="2600"/>
-            <w:tcBorders>
-              <w:top w:val="single" w:color="BFBFBF" w:sz="1"/>
-              <w:left w:val="single" w:color="BFBFBF" w:sz="1"/>
-              <w:bottom w:val="single" w:color="BFBFBF" w:sz="1"/>
-              <w:right w:val="single" w:color="BFBFBF" w:sz="1"/>
-            </w:tcBorders>
-            <w:shd w:fill="F4F7FB" w:val="clear"/>
-            <w:tcMar>
-              <w:top w:type="dxa" w:w="60"/>
-              <w:left w:type="dxa" w:w="110"/>
-              <w:bottom w:type="dxa" w:w="60"/>
-              <w:right w:type="dxa" w:w="110"/>
-            </w:tcMar>
-            <w:vAlign w:val="center"/>
-          </w:tcPr>
-          <w:p>
-            <w:pPr>
-              <w:spacing w:after="0" w:line="252"/>
-            </w:pPr>
-            <w:r>
-              <w:rPr>
-                <w:b/>
-                <w:bCs/>
-                <w:sz w:val="19"/>
-                <w:szCs w:val="19"/>
-              </w:rPr>
-              <w:t xml:space="preserve">BODA.VMS.Web (관리/MES)</w:t>
-            </w:r>
-          </w:p>
-        </w:tc>
-        <w:tc>
-          <w:tcPr>
-            <w:tcW w:type="dxa" w:w="6426"/>
-            <w:tcBorders>
-              <w:top w:val="single" w:color="BFBFBF" w:sz="1"/>
-              <w:left w:val="single" w:color="BFBFBF" w:sz="1"/>
-              <w:bottom w:val="single" w:color="BFBFBF" w:sz="1"/>
-              <w:right w:val="single" w:color="BFBFBF" w:sz="1"/>
-            </w:tcBorders>
-            <w:shd w:fill="F4F7FB" w:val="clear"/>
-            <w:tcMar>
-              <w:top w:type="dxa" w:w="60"/>
-              <w:left w:type="dxa" w:w="110"/>
-              <w:bottom w:type="dxa" w:w="60"/>
-              <w:right w:type="dxa" w:w="110"/>
-            </w:tcMar>
-            <w:vAlign w:val="center"/>
-          </w:tcPr>
-          <w:p>
-            <w:pPr>
-              <w:spacing w:after="0" w:line="252"/>
-            </w:pPr>
-            <w:r>
-              <w:rPr>
-                <w:sz w:val="19"/>
-                <w:szCs w:val="19"/>
-              </w:rPr>
-              <w:t xml:space="preserve">ASP.NET Core 8 + Blazor 웹. 대시보드·작업지시·생산이력·검사이미지 조회·알람·감사로그 등(선택 연동).</w:t>
+              <w:t xml:space="preserve">ASP.NET Core 8 + Blazor 웹. 대시보드·작업지시·생산이력·검사이미지 조회·알람·감사로그 등. 같은 설치 파일에서 「Web 서버 포함」으로 설치.</w:t>
             </w:r>
           </w:p>
         </w:tc>
@@ -4096,7 +4030,7 @@
                 <w:sz w:val="19"/>
                 <w:szCs w:val="19"/>
               </w:rPr>
-              <w:t xml:space="preserve">Robot</w:t>
+              <w:t xml:space="preserve">IO Board</w:t>
             </w:r>
           </w:p>
         </w:tc>
@@ -4127,7 +4061,7 @@
                 <w:sz w:val="19"/>
                 <w:szCs w:val="19"/>
               </w:rPr>
-              <w:t xml:space="preserve">로봇 연동 설정 (선택)</w:t>
+              <w:t xml:space="preserve">디지털 IO 보드(ADLink / Advantech) 등록 · 채널 수 설정</w:t>
             </w:r>
           </w:p>
         </w:tc>
@@ -4226,6 +4160,104 @@
                 <w:szCs w:val="19"/>
               </w:rPr>
               <w:t xml:space="preserve">초기 VMS Admin / Local Fallback Admin 계정 비밀번호 설정(기본 비밀번호 시드 없음)</w:t>
+            </w:r>
+          </w:p>
+        </w:tc>
+      </w:tr>
+      <w:tr>
+        <w:tc>
+          <w:tcPr>
+            <w:tcW w:type="dxa" w:w="1150"/>
+            <w:tcBorders>
+              <w:top w:val="single" w:color="BFBFBF" w:sz="1"/>
+              <w:left w:val="single" w:color="BFBFBF" w:sz="1"/>
+              <w:bottom w:val="single" w:color="BFBFBF" w:sz="1"/>
+              <w:right w:val="single" w:color="BFBFBF" w:sz="1"/>
+            </w:tcBorders>
+            <w:shd w:fill="F4F7FB" w:val="clear"/>
+            <w:tcMar>
+              <w:top w:type="dxa" w:w="60"/>
+              <w:left w:type="dxa" w:w="110"/>
+              <w:bottom w:type="dxa" w:w="60"/>
+              <w:right w:type="dxa" w:w="110"/>
+            </w:tcMar>
+            <w:vAlign w:val="center"/>
+          </w:tcPr>
+          <w:p>
+            <w:pPr>
+              <w:spacing w:after="0" w:line="252"/>
+            </w:pPr>
+            <w:r>
+              <w:rPr>
+                <w:rFonts w:ascii="Consolas" w:cs="Consolas" w:eastAsia="Consolas" w:hAnsi="Consolas"/>
+                <w:sz w:val="19"/>
+                <w:szCs w:val="19"/>
+              </w:rPr>
+              <w:t xml:space="preserve">AS-06</w:t>
+            </w:r>
+          </w:p>
+        </w:tc>
+        <w:tc>
+          <w:tcPr>
+            <w:tcW w:type="dxa" w:w="2700"/>
+            <w:tcBorders>
+              <w:top w:val="single" w:color="BFBFBF" w:sz="1"/>
+              <w:left w:val="single" w:color="BFBFBF" w:sz="1"/>
+              <w:bottom w:val="single" w:color="BFBFBF" w:sz="1"/>
+              <w:right w:val="single" w:color="BFBFBF" w:sz="1"/>
+            </w:tcBorders>
+            <w:shd w:fill="F4F7FB" w:val="clear"/>
+            <w:tcMar>
+              <w:top w:type="dxa" w:w="60"/>
+              <w:left w:type="dxa" w:w="110"/>
+              <w:bottom w:type="dxa" w:w="60"/>
+              <w:right w:type="dxa" w:w="110"/>
+            </w:tcMar>
+            <w:vAlign w:val="center"/>
+          </w:tcPr>
+          <w:p>
+            <w:pPr>
+              <w:spacing w:after="0" w:line="252"/>
+            </w:pPr>
+            <w:r>
+              <w:rPr>
+                <w:b/>
+                <w:bCs/>
+                <w:sz w:val="19"/>
+                <w:szCs w:val="19"/>
+              </w:rPr>
+              <w:t xml:space="preserve">Security &amp; License</w:t>
+            </w:r>
+          </w:p>
+        </w:tc>
+        <w:tc>
+          <w:tcPr>
+            <w:tcW w:type="dxa" w:w="5176"/>
+            <w:tcBorders>
+              <w:top w:val="single" w:color="BFBFBF" w:sz="1"/>
+              <w:left w:val="single" w:color="BFBFBF" w:sz="1"/>
+              <w:bottom w:val="single" w:color="BFBFBF" w:sz="1"/>
+              <w:right w:val="single" w:color="BFBFBF" w:sz="1"/>
+            </w:tcBorders>
+            <w:shd w:fill="F4F7FB" w:val="clear"/>
+            <w:tcMar>
+              <w:top w:type="dxa" w:w="60"/>
+              <w:left w:type="dxa" w:w="110"/>
+              <w:bottom w:type="dxa" w:w="60"/>
+              <w:right w:type="dxa" w:w="110"/>
+            </w:tcMar>
+            <w:vAlign w:val="center"/>
+          </w:tcPr>
+          <w:p>
+            <w:pPr>
+              <w:spacing w:after="0" w:line="252"/>
+            </w:pPr>
+            <w:r>
+              <w:rPr>
+                <w:sz w:val="19"/>
+                <w:szCs w:val="19"/>
+              </w:rPr>
+              <w:t xml:space="preserve">보안 모드(Production / Development) 저장, SW 라이선스 설치 · 상태 확인</w:t>
             </w:r>
           </w:p>
         </w:tc>
@@ -8935,7 +8967,105 @@
                 <w:sz w:val="19"/>
                 <w:szCs w:val="19"/>
               </w:rPr>
-              <w:t xml:space="preserve">카메라/핸드아이 캘리브레이션</w:t>
+              <w:t xml:space="preserve">카메라 캘리브레이션 (체커보드 · 원형 그리드)</w:t>
+            </w:r>
+          </w:p>
+        </w:tc>
+      </w:tr>
+      <w:tr>
+        <w:tc>
+          <w:tcPr>
+            <w:tcW w:type="dxa" w:w="1150"/>
+            <w:tcBorders>
+              <w:top w:val="single" w:color="BFBFBF" w:sz="1"/>
+              <w:left w:val="single" w:color="BFBFBF" w:sz="1"/>
+              <w:bottom w:val="single" w:color="BFBFBF" w:sz="1"/>
+              <w:right w:val="single" w:color="BFBFBF" w:sz="1"/>
+            </w:tcBorders>
+            <w:shd w:fill="F4F7FB" w:val="clear"/>
+            <w:tcMar>
+              <w:top w:type="dxa" w:w="60"/>
+              <w:left w:type="dxa" w:w="110"/>
+              <w:bottom w:type="dxa" w:w="60"/>
+              <w:right w:type="dxa" w:w="110"/>
+            </w:tcMar>
+            <w:vAlign w:val="center"/>
+          </w:tcPr>
+          <w:p>
+            <w:pPr>
+              <w:spacing w:after="0" w:line="252"/>
+            </w:pPr>
+            <w:r>
+              <w:rPr>
+                <w:rFonts w:ascii="Consolas" w:cs="Consolas" w:eastAsia="Consolas" w:hAnsi="Consolas"/>
+                <w:sz w:val="19"/>
+                <w:szCs w:val="19"/>
+              </w:rPr>
+              <w:t xml:space="preserve">VS-08</w:t>
+            </w:r>
+          </w:p>
+        </w:tc>
+        <w:tc>
+          <w:tcPr>
+            <w:tcW w:type="dxa" w:w="2700"/>
+            <w:tcBorders>
+              <w:top w:val="single" w:color="BFBFBF" w:sz="1"/>
+              <w:left w:val="single" w:color="BFBFBF" w:sz="1"/>
+              <w:bottom w:val="single" w:color="BFBFBF" w:sz="1"/>
+              <w:right w:val="single" w:color="BFBFBF" w:sz="1"/>
+            </w:tcBorders>
+            <w:shd w:fill="F4F7FB" w:val="clear"/>
+            <w:tcMar>
+              <w:top w:type="dxa" w:w="60"/>
+              <w:left w:type="dxa" w:w="110"/>
+              <w:bottom w:type="dxa" w:w="60"/>
+              <w:right w:type="dxa" w:w="110"/>
+            </w:tcMar>
+            <w:vAlign w:val="center"/>
+          </w:tcPr>
+          <w:p>
+            <w:pPr>
+              <w:spacing w:after="0" w:line="252"/>
+            </w:pPr>
+            <w:r>
+              <w:rPr>
+                <w:b/>
+                <w:bCs/>
+                <w:sz w:val="19"/>
+                <w:szCs w:val="19"/>
+              </w:rPr>
+              <w:t xml:space="preserve">3D Data</w:t>
+            </w:r>
+          </w:p>
+        </w:tc>
+        <w:tc>
+          <w:tcPr>
+            <w:tcW w:type="dxa" w:w="5176"/>
+            <w:tcBorders>
+              <w:top w:val="single" w:color="BFBFBF" w:sz="1"/>
+              <w:left w:val="single" w:color="BFBFBF" w:sz="1"/>
+              <w:bottom w:val="single" w:color="BFBFBF" w:sz="1"/>
+              <w:right w:val="single" w:color="BFBFBF" w:sz="1"/>
+            </w:tcBorders>
+            <w:shd w:fill="F4F7FB" w:val="clear"/>
+            <w:tcMar>
+              <w:top w:type="dxa" w:w="60"/>
+              <w:left w:type="dxa" w:w="110"/>
+              <w:bottom w:type="dxa" w:w="60"/>
+              <w:right w:type="dxa" w:w="110"/>
+            </w:tcMar>
+            <w:vAlign w:val="center"/>
+          </w:tcPr>
+          <w:p>
+            <w:pPr>
+              <w:spacing w:after="0" w:line="252"/>
+            </w:pPr>
+            <w:r>
+              <w:rPr>
+                <w:sz w:val="19"/>
+                <w:szCs w:val="19"/>
+              </w:rPr>
+              <w:t xml:space="preserve">저장 점군(.vpc) 불러오기 · 저장, 높이 맵 생성 — 3D 검사 도구의 입력</w:t>
             </w:r>
           </w:p>
         </w:tc>
@@ -10608,7 +10738,7 @@
                 <w:sz w:val="19"/>
                 <w:szCs w:val="19"/>
               </w:rPr>
-              <w:t xml:space="preserve">얼라인 — Match Align / Multi-Step Align (2종), 로봇·스테이지 보정량 산출</w:t>
+              <w:t xml:space="preserve">얼라인 — Match Align / Multi-Step Align (2종), 설비(스테이지) 보정량 산출</w:t>
             </w:r>
           </w:p>
         </w:tc>

</xml_diff>